<commit_message>
Poblacion de la base de datos y inputs del doc
</commit_message>
<xml_diff>
--- a/data/INPUTs creacion.docx
+++ b/data/INPUTs creacion.docx
@@ -136,9 +136,6 @@
     <w:p>
       <w:pPr>
         <w:spacing w:after="0" w:line="240" w:lineRule="auto"/>
-        <w:rPr>
-          <w:lang w:val="en-US"/>
-        </w:rPr>
       </w:pPr>
       <w:r>
         <w:rPr>
@@ -147,9 +144,6 @@
         <w:t xml:space="preserve">  </w:t>
       </w:r>
       <w:r>
-        <w:rPr>
-          <w:lang w:val="en-US"/>
-        </w:rPr>
         <w:t>"email": "ariel.rojo@gamehub.cl",</w:t>
       </w:r>
     </w:p>
@@ -161,9 +155,6 @@
         </w:rPr>
       </w:pPr>
       <w:r>
-        <w:rPr>
-          <w:lang w:val="en-US"/>
-        </w:rPr>
         <w:t xml:space="preserve">  </w:t>
       </w:r>
       <w:r>
@@ -561,11 +552,6 @@
           <w:lang w:val="en-US"/>
         </w:rPr>
         <w:br/>
-      </w:r>
-      <w:r>
-        <w:rPr>
-          <w:lang w:val="en-US"/>
-        </w:rPr>
         <w:t>{</w:t>
       </w:r>
     </w:p>
@@ -749,192 +735,89 @@
     <w:p>
       <w:pPr>
         <w:spacing w:after="0" w:line="240" w:lineRule="auto"/>
-        <w:rPr>
-          <w:lang w:val="en-US"/>
-        </w:rPr>
-      </w:pPr>
-      <w:r>
-        <w:rPr>
-          <w:lang w:val="en-US"/>
-        </w:rPr>
+      </w:pPr>
+      <w:r>
         <w:t>{</w:t>
       </w:r>
     </w:p>
     <w:p>
       <w:pPr>
         <w:spacing w:after="0" w:line="240" w:lineRule="auto"/>
-        <w:rPr>
-          <w:lang w:val="en-US"/>
-        </w:rPr>
-      </w:pPr>
-      <w:r>
-        <w:rPr>
-          <w:lang w:val="en-US"/>
-        </w:rPr>
-        <w:t>  "</w:t>
-      </w:r>
-      <w:proofErr w:type="spellStart"/>
-      <w:r>
-        <w:rPr>
-          <w:lang w:val="en-US"/>
-        </w:rPr>
-        <w:t>nombre</w:t>
-      </w:r>
-      <w:proofErr w:type="spellEnd"/>
-      <w:r>
-        <w:rPr>
-          <w:lang w:val="en-US"/>
-        </w:rPr>
-        <w:t>": "Arthur Morgan",</w:t>
-      </w:r>
-    </w:p>
-    <w:p>
-      <w:pPr>
-        <w:spacing w:after="0" w:line="240" w:lineRule="auto"/>
-        <w:rPr>
-          <w:lang w:val="en-US"/>
-        </w:rPr>
-      </w:pPr>
-      <w:r>
-        <w:rPr>
-          <w:lang w:val="en-US"/>
-        </w:rPr>
-        <w:t>  "email": "arthur.morgan@gamehub.cl",</w:t>
-      </w:r>
-    </w:p>
-    <w:p>
-      <w:pPr>
-        <w:spacing w:after="0" w:line="240" w:lineRule="auto"/>
-        <w:rPr>
-          <w:lang w:val="en-US"/>
-        </w:rPr>
-      </w:pPr>
-      <w:r>
-        <w:rPr>
-          <w:lang w:val="en-US"/>
-        </w:rPr>
+      </w:pPr>
+      <w:r>
+        <w:t>  "nombre": "Arthur Morgan",</w:t>
+      </w:r>
+    </w:p>
+    <w:p>
+      <w:pPr>
+        <w:spacing w:after="0" w:line="240" w:lineRule="auto"/>
+        <w:rPr>
+          <w:lang w:val="en-US"/>
+        </w:rPr>
+      </w:pPr>
+      <w:r>
         <w:t xml:space="preserve">  </w:t>
       </w:r>
       <w:r>
         <w:rPr>
           <w:lang w:val="en-US"/>
         </w:rPr>
+        <w:t>"email": "arthur.morgan@gamehub.cl",</w:t>
+      </w:r>
+    </w:p>
+    <w:p>
+      <w:pPr>
+        <w:spacing w:after="0" w:line="240" w:lineRule="auto"/>
+      </w:pPr>
+      <w:r>
+        <w:rPr>
+          <w:lang w:val="en-US"/>
+        </w:rPr>
+        <w:t xml:space="preserve">  </w:t>
+      </w:r>
+      <w:r>
         <w:t>"</w:t>
       </w:r>
       <w:proofErr w:type="spellStart"/>
       <w:r>
-        <w:rPr>
-          <w:lang w:val="en-US"/>
-        </w:rPr>
         <w:t>telefono</w:t>
       </w:r>
       <w:proofErr w:type="spellEnd"/>
       <w:r>
-        <w:rPr>
-          <w:lang w:val="en-US"/>
-        </w:rPr>
         <w:t>": "912345678",</w:t>
       </w:r>
     </w:p>
     <w:p>
       <w:pPr>
         <w:spacing w:after="0" w:line="240" w:lineRule="auto"/>
-        <w:rPr>
-          <w:lang w:val="en-US"/>
-        </w:rPr>
-      </w:pPr>
-      <w:r>
-        <w:rPr>
-          <w:lang w:val="en-US"/>
-        </w:rPr>
-        <w:t>  "</w:t>
-      </w:r>
-      <w:proofErr w:type="spellStart"/>
-      <w:r>
-        <w:rPr>
-          <w:lang w:val="en-US"/>
-        </w:rPr>
-        <w:t>rol</w:t>
-      </w:r>
-      <w:proofErr w:type="spellEnd"/>
-      <w:r>
-        <w:rPr>
-          <w:lang w:val="en-US"/>
-        </w:rPr>
-        <w:t>": "CLIENTE"</w:t>
-      </w:r>
-    </w:p>
-    <w:p>
-      <w:pPr>
-        <w:spacing w:after="0" w:line="240" w:lineRule="auto"/>
-        <w:rPr>
-          <w:lang w:val="en-US"/>
-        </w:rPr>
-      </w:pPr>
-      <w:r>
-        <w:rPr>
-          <w:lang w:val="en-US"/>
-        </w:rPr>
+      </w:pPr>
+      <w:r>
+        <w:t>  "rol": "CLIENTE"</w:t>
+      </w:r>
+    </w:p>
+    <w:p>
+      <w:pPr>
+        <w:spacing w:after="0" w:line="240" w:lineRule="auto"/>
+      </w:pPr>
+      <w:r>
         <w:t>}</w:t>
       </w:r>
     </w:p>
-    <w:p>
-      <w:pPr>
-        <w:rPr>
-          <w:lang w:val="en-US"/>
-        </w:rPr>
-      </w:pPr>
-    </w:p>
-    <w:p>
-      <w:pPr>
-        <w:rPr>
-          <w:lang w:val="en-US"/>
-        </w:rPr>
-      </w:pPr>
+    <w:p/>
+    <w:p>
       <w:r>
         <w:rPr>
           <w:sz w:val="36"/>
           <w:szCs w:val="36"/>
           <w:highlight w:val="yellow"/>
-          <w:lang w:val="en-US"/>
         </w:rPr>
         <w:t>AUTH-SERVICE:</w:t>
       </w:r>
       <w:r>
-        <w:rPr>
-          <w:lang w:val="en-US"/>
-        </w:rPr>
         <w:br/>
       </w:r>
       <w:r>
-        <w:rPr>
-          <w:lang w:val="en-US"/>
-        </w:rPr>
-        <w:t>http://localhost:808</w:t>
-      </w:r>
-      <w:r>
-        <w:rPr>
-          <w:lang w:val="en-US"/>
-        </w:rPr>
-        <w:t>2</w:t>
-      </w:r>
-      <w:r>
-        <w:rPr>
-          <w:lang w:val="en-US"/>
-        </w:rPr>
-        <w:t>/api/</w:t>
-      </w:r>
-      <w:r>
-        <w:rPr>
-          <w:lang w:val="en-US"/>
-        </w:rPr>
-        <w:t>auth/</w:t>
-      </w:r>
-      <w:r>
-        <w:rPr>
-          <w:lang w:val="en-US"/>
-        </w:rPr>
-        <w:t>cuentas</w:t>
+        <w:t>http://localhost:8082/api/auth/cuentas</w:t>
       </w:r>
     </w:p>
     <w:p>
@@ -1165,7 +1048,7 @@
       <w:pPr>
         <w:spacing w:after="0" w:line="240" w:lineRule="auto"/>
         <w:rPr>
-          <w:lang w:val="es-MX"/>
+          <w:lang w:val="en-US"/>
         </w:rPr>
       </w:pPr>
       <w:r>
@@ -1176,61 +1059,49 @@
       </w:r>
       <w:r>
         <w:rPr>
-          <w:lang w:val="es-MX"/>
-        </w:rPr>
-        <w:t>"</w:t>
-      </w:r>
-      <w:proofErr w:type="spellStart"/>
-      <w:r>
-        <w:rPr>
-          <w:lang w:val="es-MX"/>
-        </w:rPr>
-        <w:t>password</w:t>
-      </w:r>
-      <w:proofErr w:type="spellEnd"/>
-      <w:r>
-        <w:rPr>
-          <w:lang w:val="es-MX"/>
-        </w:rPr>
-        <w:t>": "</w:t>
-      </w:r>
-      <w:r>
-        <w:rPr>
-          <w:lang w:val="es-MX"/>
-        </w:rPr>
-        <w:t>Maximiliano</w:t>
-      </w:r>
-      <w:r>
-        <w:rPr>
-          <w:lang w:val="es-MX"/>
-        </w:rPr>
-        <w:t>",</w:t>
-      </w:r>
-    </w:p>
-    <w:p>
-      <w:pPr>
-        <w:spacing w:after="0" w:line="240" w:lineRule="auto"/>
-        <w:rPr>
-          <w:lang w:val="es-MX"/>
-        </w:rPr>
-      </w:pPr>
-      <w:r>
-        <w:rPr>
-          <w:lang w:val="es-MX"/>
-        </w:rPr>
-        <w:t xml:space="preserve">  "rol": "CLIENTE"</w:t>
-      </w:r>
-    </w:p>
-    <w:p>
-      <w:pPr>
-        <w:spacing w:after="0" w:line="240" w:lineRule="auto"/>
-        <w:rPr>
-          <w:lang w:val="es-MX"/>
-        </w:rPr>
-      </w:pPr>
-      <w:r>
-        <w:rPr>
-          <w:lang w:val="es-MX"/>
+          <w:lang w:val="en-US"/>
+        </w:rPr>
+        <w:t>"password": "Maximiliano",</w:t>
+      </w:r>
+    </w:p>
+    <w:p>
+      <w:pPr>
+        <w:spacing w:after="0" w:line="240" w:lineRule="auto"/>
+        <w:rPr>
+          <w:lang w:val="en-US"/>
+        </w:rPr>
+      </w:pPr>
+      <w:r>
+        <w:rPr>
+          <w:lang w:val="en-US"/>
+        </w:rPr>
+        <w:t xml:space="preserve">  "</w:t>
+      </w:r>
+      <w:proofErr w:type="spellStart"/>
+      <w:r>
+        <w:rPr>
+          <w:lang w:val="en-US"/>
+        </w:rPr>
+        <w:t>rol</w:t>
+      </w:r>
+      <w:proofErr w:type="spellEnd"/>
+      <w:r>
+        <w:rPr>
+          <w:lang w:val="en-US"/>
+        </w:rPr>
+        <w:t>": "CLIENTE"</w:t>
+      </w:r>
+    </w:p>
+    <w:p>
+      <w:pPr>
+        <w:spacing w:after="0" w:line="240" w:lineRule="auto"/>
+        <w:rPr>
+          <w:lang w:val="en-US"/>
+        </w:rPr>
+      </w:pPr>
+      <w:r>
+        <w:rPr>
+          <w:lang w:val="en-US"/>
         </w:rPr>
         <w:t>}</w:t>
       </w:r>
@@ -1239,15 +1110,15 @@
       <w:pPr>
         <w:spacing w:after="0" w:line="240" w:lineRule="auto"/>
         <w:rPr>
-          <w:lang w:val="es-MX"/>
-        </w:rPr>
-      </w:pPr>
-    </w:p>
-    <w:p>
-      <w:pPr>
-        <w:spacing w:after="0" w:line="240" w:lineRule="auto"/>
-        <w:rPr>
-          <w:lang w:val="es-MX"/>
+          <w:lang w:val="en-US"/>
+        </w:rPr>
+      </w:pPr>
+    </w:p>
+    <w:p>
+      <w:pPr>
+        <w:spacing w:after="0" w:line="240" w:lineRule="auto"/>
+        <w:rPr>
+          <w:lang w:val="en-US"/>
         </w:rPr>
       </w:pPr>
     </w:p>
@@ -1258,193 +1129,62 @@
           <w:sz w:val="36"/>
           <w:szCs w:val="36"/>
           <w:highlight w:val="yellow"/>
-          <w:lang w:val="es-MX"/>
-        </w:rPr>
-      </w:pPr>
-    </w:p>
-    <w:p>
-      <w:pPr>
-        <w:spacing w:after="0" w:line="240" w:lineRule="auto"/>
-        <w:rPr>
-          <w:lang w:val="es-MX"/>
-        </w:rPr>
-      </w:pPr>
+          <w:lang w:val="en-US"/>
+        </w:rPr>
+      </w:pPr>
+    </w:p>
+    <w:p>
+      <w:pPr>
+        <w:spacing w:after="0" w:line="240" w:lineRule="auto"/>
+        <w:rPr>
+          <w:lang w:val="en-US"/>
+        </w:rPr>
+      </w:pPr>
+      <w:proofErr w:type="gramStart"/>
       <w:r>
         <w:rPr>
           <w:sz w:val="36"/>
           <w:szCs w:val="36"/>
           <w:highlight w:val="yellow"/>
-          <w:lang w:val="es-MX"/>
-        </w:rPr>
-        <w:t>CATEGORY-SERVICE:</w:t>
-      </w:r>
-    </w:p>
-    <w:p>
-      <w:pPr>
-        <w:spacing w:after="0" w:line="240" w:lineRule="auto"/>
-        <w:rPr>
-          <w:lang w:val="es-MX"/>
-        </w:rPr>
-      </w:pPr>
-      <w:r>
-        <w:rPr>
-          <w:lang w:val="es-MX"/>
-        </w:rPr>
-        <w:t>http://localhost:8081/api/categories</w:t>
-      </w:r>
-    </w:p>
-    <w:p>
-      <w:pPr>
-        <w:spacing w:after="0" w:line="240" w:lineRule="auto"/>
-        <w:rPr>
-          <w:lang w:val="es-MX"/>
-        </w:rPr>
-      </w:pPr>
-      <w:r>
-        <w:rPr>
-          <w:lang w:val="es-MX"/>
-        </w:rPr>
-        <w:t>{</w:t>
-      </w:r>
-    </w:p>
-    <w:p>
-      <w:pPr>
-        <w:spacing w:after="0" w:line="240" w:lineRule="auto"/>
-        <w:rPr>
-          <w:lang w:val="es-MX"/>
-        </w:rPr>
-      </w:pPr>
-      <w:r>
-        <w:rPr>
-          <w:lang w:val="es-MX"/>
-        </w:rPr>
-        <w:t xml:space="preserve">  "nombre": "Aventura",</w:t>
-      </w:r>
-    </w:p>
-    <w:p>
-      <w:pPr>
-        <w:spacing w:after="0" w:line="240" w:lineRule="auto"/>
-        <w:rPr>
-          <w:lang w:val="es-MX"/>
-        </w:rPr>
-      </w:pPr>
-      <w:r>
-        <w:rPr>
-          <w:lang w:val="es-MX"/>
-        </w:rPr>
-        <w:t xml:space="preserve">  "</w:t>
-      </w:r>
-      <w:proofErr w:type="spellStart"/>
-      <w:r>
-        <w:rPr>
-          <w:lang w:val="es-MX"/>
-        </w:rPr>
-        <w:t>descripcion</w:t>
-      </w:r>
-      <w:proofErr w:type="spellEnd"/>
-      <w:r>
-        <w:rPr>
-          <w:lang w:val="es-MX"/>
-        </w:rPr>
-        <w:t xml:space="preserve">": "Juegos de </w:t>
-      </w:r>
-      <w:proofErr w:type="spellStart"/>
-      <w:r>
-        <w:rPr>
-          <w:lang w:val="es-MX"/>
-        </w:rPr>
-        <w:t>exploracion</w:t>
-      </w:r>
-      <w:proofErr w:type="spellEnd"/>
-      <w:r>
-        <w:rPr>
-          <w:lang w:val="es-MX"/>
-        </w:rPr>
-        <w:t xml:space="preserve"> mundo abierto y rol"</w:t>
-      </w:r>
-    </w:p>
-    <w:p>
-      <w:pPr>
-        <w:spacing w:after="0" w:line="240" w:lineRule="auto"/>
-        <w:rPr>
-          <w:lang w:val="es-MX"/>
-        </w:rPr>
-      </w:pPr>
-      <w:r>
-        <w:rPr>
-          <w:lang w:val="es-MX"/>
-        </w:rPr>
-        <w:t>}</w:t>
-      </w:r>
-    </w:p>
-    <w:p>
-      <w:pPr>
-        <w:spacing w:after="0" w:line="240" w:lineRule="auto"/>
-        <w:rPr>
-          <w:lang w:val="es-MX"/>
-        </w:rPr>
-      </w:pPr>
-    </w:p>
-    <w:p>
-      <w:pPr>
-        <w:spacing w:after="0" w:line="240" w:lineRule="auto"/>
-        <w:rPr>
-          <w:lang w:val="es-MX"/>
-        </w:rPr>
-      </w:pPr>
-    </w:p>
-    <w:p>
-      <w:pPr>
-        <w:spacing w:after="0" w:line="240" w:lineRule="auto"/>
-        <w:rPr>
-          <w:lang w:val="es-MX"/>
-        </w:rPr>
-      </w:pPr>
-    </w:p>
-    <w:p>
-      <w:pPr>
-        <w:spacing w:after="0" w:line="240" w:lineRule="auto"/>
-        <w:rPr>
-          <w:sz w:val="36"/>
-          <w:szCs w:val="36"/>
-          <w:lang w:val="es-MX"/>
-        </w:rPr>
-      </w:pPr>
+          <w:lang w:val="en-US"/>
+        </w:rPr>
+        <w:t>CATEGORY-SERVICE</w:t>
+      </w:r>
+      <w:proofErr w:type="gramEnd"/>
       <w:r>
         <w:rPr>
           <w:sz w:val="36"/>
           <w:szCs w:val="36"/>
           <w:highlight w:val="yellow"/>
-          <w:lang w:val="es-MX"/>
-        </w:rPr>
-        <w:lastRenderedPageBreak/>
-        <w:t>PRODUCT-SERVICE:</w:t>
-      </w:r>
-    </w:p>
-    <w:p>
-      <w:pPr>
-        <w:spacing w:after="0" w:line="240" w:lineRule="auto"/>
-        <w:rPr>
-          <w:lang w:val="es-MX"/>
-        </w:rPr>
-      </w:pPr>
-      <w:r>
-        <w:rPr>
-          <w:lang w:val="es-MX"/>
-        </w:rPr>
-        <w:t>http://localhost:8083/api/products</w:t>
-      </w:r>
-    </w:p>
-    <w:p>
-      <w:pPr>
-        <w:spacing w:after="0" w:line="240" w:lineRule="auto"/>
-        <w:rPr>
-          <w:lang w:val="en-US"/>
-        </w:rPr>
-      </w:pPr>
-      <w:r>
-        <w:rPr>
-          <w:lang w:val="en-US"/>
+          <w:lang w:val="en-US"/>
+        </w:rPr>
+        <w:t>:</w:t>
+      </w:r>
+    </w:p>
+    <w:p>
+      <w:pPr>
+        <w:spacing w:after="0" w:line="240" w:lineRule="auto"/>
+        <w:rPr>
+          <w:lang w:val="es-MX"/>
+        </w:rPr>
+      </w:pPr>
+      <w:r>
+        <w:rPr>
+          <w:lang w:val="es-MX"/>
+        </w:rPr>
+        <w:t>http://localhost:8081/api/categories</w:t>
+      </w:r>
+    </w:p>
+    <w:p>
+      <w:pPr>
+        <w:spacing w:after="0" w:line="240" w:lineRule="auto"/>
+        <w:rPr>
+          <w:lang w:val="es-MX"/>
+        </w:rPr>
+      </w:pPr>
+      <w:r>
+        <w:rPr>
+          <w:lang w:val="es-MX"/>
         </w:rPr>
         <w:t>{</w:t>
       </w:r>
@@ -1453,80 +1193,32 @@
       <w:pPr>
         <w:spacing w:after="0" w:line="240" w:lineRule="auto"/>
         <w:rPr>
-          <w:lang w:val="en-US"/>
-        </w:rPr>
-      </w:pPr>
-      <w:r>
-        <w:rPr>
-          <w:lang w:val="en-US"/>
+          <w:lang w:val="es-MX"/>
+        </w:rPr>
+      </w:pPr>
+      <w:r>
+        <w:rPr>
+          <w:lang w:val="es-MX"/>
+        </w:rPr>
+        <w:t xml:space="preserve">  "nombre": "Aventura",</w:t>
+      </w:r>
+    </w:p>
+    <w:p>
+      <w:pPr>
+        <w:spacing w:after="0" w:line="240" w:lineRule="auto"/>
+        <w:rPr>
+          <w:lang w:val="es-MX"/>
+        </w:rPr>
+      </w:pPr>
+      <w:r>
+        <w:rPr>
+          <w:lang w:val="es-MX"/>
         </w:rPr>
         <w:t xml:space="preserve">  "</w:t>
       </w:r>
       <w:proofErr w:type="spellStart"/>
       <w:r>
         <w:rPr>
-          <w:lang w:val="en-US"/>
-        </w:rPr>
-        <w:t>nombre</w:t>
-      </w:r>
-      <w:proofErr w:type="spellEnd"/>
-      <w:r>
-        <w:rPr>
-          <w:lang w:val="en-US"/>
-        </w:rPr>
-        <w:t>": "The Legend of Zelda: Tears of the Kingdom",</w:t>
-      </w:r>
-    </w:p>
-    <w:p>
-      <w:pPr>
-        <w:spacing w:after="0" w:line="240" w:lineRule="auto"/>
-        <w:rPr>
-          <w:lang w:val="es-MX"/>
-        </w:rPr>
-      </w:pPr>
-      <w:r>
-        <w:rPr>
-          <w:lang w:val="en-US"/>
-        </w:rPr>
-        <w:t xml:space="preserve">  </w:t>
-      </w:r>
-      <w:r>
-        <w:rPr>
-          <w:lang w:val="es-MX"/>
-        </w:rPr>
-        <w:t>"marca": "Nintendo",</w:t>
-      </w:r>
-    </w:p>
-    <w:p>
-      <w:pPr>
-        <w:spacing w:after="0" w:line="240" w:lineRule="auto"/>
-        <w:rPr>
-          <w:lang w:val="es-MX"/>
-        </w:rPr>
-      </w:pPr>
-      <w:r>
-        <w:rPr>
-          <w:lang w:val="es-MX"/>
-        </w:rPr>
-        <w:t xml:space="preserve">  "modelo": "Switch",</w:t>
-      </w:r>
-    </w:p>
-    <w:p>
-      <w:pPr>
-        <w:spacing w:after="0" w:line="240" w:lineRule="auto"/>
-        <w:rPr>
-          <w:lang w:val="es-MX"/>
-        </w:rPr>
-      </w:pPr>
-      <w:r>
-        <w:rPr>
-          <w:lang w:val="es-MX"/>
-        </w:rPr>
-        <w:t xml:space="preserve">  "</w:t>
-      </w:r>
-      <w:proofErr w:type="spellStart"/>
-      <w:r>
-        <w:rPr>
           <w:lang w:val="es-MX"/>
         </w:rPr>
         <w:t>descripcion</w:t>
@@ -1536,77 +1228,21 @@
         <w:rPr>
           <w:lang w:val="es-MX"/>
         </w:rPr>
-        <w:t xml:space="preserve">": "Secuela directa de Breath </w:t>
-      </w:r>
-      <w:proofErr w:type="spellStart"/>
-      <w:r>
-        <w:rPr>
-          <w:lang w:val="es-MX"/>
-        </w:rPr>
-        <w:t>of</w:t>
-      </w:r>
-      <w:proofErr w:type="spellEnd"/>
-      <w:r>
-        <w:rPr>
-          <w:lang w:val="es-MX"/>
-        </w:rPr>
-        <w:t xml:space="preserve"> </w:t>
-      </w:r>
-      <w:proofErr w:type="spellStart"/>
-      <w:r>
-        <w:rPr>
-          <w:lang w:val="es-MX"/>
-        </w:rPr>
-        <w:t>the</w:t>
-      </w:r>
-      <w:proofErr w:type="spellEnd"/>
-      <w:r>
-        <w:rPr>
-          <w:lang w:val="es-MX"/>
-        </w:rPr>
-        <w:t xml:space="preserve"> Wild",</w:t>
-      </w:r>
-    </w:p>
-    <w:p>
-      <w:pPr>
-        <w:spacing w:after="0" w:line="240" w:lineRule="auto"/>
-        <w:rPr>
-          <w:lang w:val="es-MX"/>
-        </w:rPr>
-      </w:pPr>
-      <w:r>
-        <w:rPr>
-          <w:lang w:val="es-MX"/>
-        </w:rPr>
-        <w:t xml:space="preserve">  "precio": 69.99,</w:t>
-      </w:r>
-    </w:p>
-    <w:p>
-      <w:pPr>
-        <w:spacing w:after="0" w:line="240" w:lineRule="auto"/>
-        <w:rPr>
-          <w:lang w:val="es-MX"/>
-        </w:rPr>
-      </w:pPr>
-      <w:r>
-        <w:rPr>
-          <w:lang w:val="es-MX"/>
-        </w:rPr>
-        <w:t xml:space="preserve">  "</w:t>
-      </w:r>
-      <w:proofErr w:type="spellStart"/>
-      <w:r>
-        <w:rPr>
-          <w:lang w:val="es-MX"/>
-        </w:rPr>
-        <w:t>categoriaId</w:t>
-      </w:r>
-      <w:proofErr w:type="spellEnd"/>
-      <w:r>
-        <w:rPr>
-          <w:lang w:val="es-MX"/>
-        </w:rPr>
-        <w:t>": 1</w:t>
+        <w:t xml:space="preserve">": "Juegos de </w:t>
+      </w:r>
+      <w:proofErr w:type="spellStart"/>
+      <w:r>
+        <w:rPr>
+          <w:lang w:val="es-MX"/>
+        </w:rPr>
+        <w:t>exploracion</w:t>
+      </w:r>
+      <w:proofErr w:type="spellEnd"/>
+      <w:r>
+        <w:rPr>
+          <w:lang w:val="es-MX"/>
+        </w:rPr>
+        <w:t xml:space="preserve"> mundo abierto y rol"</w:t>
       </w:r>
     </w:p>
     <w:p>
@@ -1622,6 +1258,14 @@
         </w:rPr>
         <w:t>}</w:t>
       </w:r>
+    </w:p>
+    <w:p>
+      <w:pPr>
+        <w:spacing w:after="0" w:line="240" w:lineRule="auto"/>
+        <w:rPr>
+          <w:lang w:val="es-MX"/>
+        </w:rPr>
+      </w:pPr>
     </w:p>
     <w:p>
       <w:pPr>
@@ -1655,33 +1299,22 @@
           <w:highlight w:val="yellow"/>
           <w:lang w:val="es-MX"/>
         </w:rPr>
-        <w:t>INVENTORY-SERVICE:</w:t>
-      </w:r>
-    </w:p>
-    <w:p>
-      <w:pPr>
-        <w:spacing w:after="0" w:line="240" w:lineRule="auto"/>
-        <w:rPr>
-          <w:lang w:val="es-MX"/>
-        </w:rPr>
-      </w:pPr>
-      <w:r>
-        <w:rPr>
-          <w:lang w:val="es-MX"/>
-        </w:rPr>
-        <w:t>http://localhost:808</w:t>
-      </w:r>
-      <w:r>
-        <w:rPr>
-          <w:lang w:val="es-MX"/>
-        </w:rPr>
-        <w:t>5</w:t>
-      </w:r>
-      <w:r>
-        <w:rPr>
-          <w:lang w:val="es-MX"/>
-        </w:rPr>
-        <w:t>/api/inventories</w:t>
+        <w:lastRenderedPageBreak/>
+        <w:t>PRODUCT-SERVICE:</w:t>
+      </w:r>
+    </w:p>
+    <w:p>
+      <w:pPr>
+        <w:spacing w:after="0" w:line="240" w:lineRule="auto"/>
+        <w:rPr>
+          <w:lang w:val="es-MX"/>
+        </w:rPr>
+      </w:pPr>
+      <w:r>
+        <w:rPr>
+          <w:lang w:val="es-MX"/>
+        </w:rPr>
+        <w:t>http://localhost:8083/api/products</w:t>
       </w:r>
     </w:p>
     <w:p>
@@ -1716,54 +1349,200 @@
         <w:rPr>
           <w:lang w:val="en-US"/>
         </w:rPr>
-        <w:t>productId</w:t>
-      </w:r>
-      <w:proofErr w:type="spellEnd"/>
-      <w:r>
-        <w:rPr>
-          <w:lang w:val="en-US"/>
-        </w:rPr>
-        <w:t>": 1,</w:t>
-      </w:r>
-    </w:p>
-    <w:p>
-      <w:pPr>
-        <w:spacing w:after="0" w:line="240" w:lineRule="auto"/>
-        <w:rPr>
-          <w:lang w:val="en-US"/>
-        </w:rPr>
-      </w:pPr>
-      <w:r>
-        <w:rPr>
-          <w:lang w:val="en-US"/>
-        </w:rPr>
-        <w:t xml:space="preserve">  "quantity": 150,</w:t>
-      </w:r>
-    </w:p>
-    <w:p>
-      <w:pPr>
-        <w:spacing w:after="0" w:line="240" w:lineRule="auto"/>
-        <w:rPr>
-          <w:lang w:val="en-US"/>
-        </w:rPr>
-      </w:pPr>
-      <w:r>
-        <w:rPr>
-          <w:lang w:val="en-US"/>
-        </w:rPr>
-        <w:t xml:space="preserve">  "location": "Bodega Central"</w:t>
-      </w:r>
-    </w:p>
-    <w:p>
-      <w:pPr>
-        <w:spacing w:after="0" w:line="240" w:lineRule="auto"/>
-        <w:rPr>
-          <w:lang w:val="es-MX"/>
-        </w:rPr>
-      </w:pPr>
-      <w:r>
-        <w:rPr>
-          <w:lang w:val="es-MX"/>
+        <w:t>nombre</w:t>
+      </w:r>
+      <w:proofErr w:type="spellEnd"/>
+      <w:r>
+        <w:rPr>
+          <w:lang w:val="en-US"/>
+        </w:rPr>
+        <w:t>": "The Legend of Zelda: Tears of the Kingdom",</w:t>
+      </w:r>
+    </w:p>
+    <w:p>
+      <w:pPr>
+        <w:spacing w:after="0" w:line="240" w:lineRule="auto"/>
+        <w:rPr>
+          <w:lang w:val="en-US"/>
+        </w:rPr>
+      </w:pPr>
+      <w:r>
+        <w:rPr>
+          <w:lang w:val="en-US"/>
+        </w:rPr>
+        <w:t xml:space="preserve">  </w:t>
+      </w:r>
+      <w:r>
+        <w:rPr>
+          <w:lang w:val="en-US"/>
+        </w:rPr>
+        <w:t>"</w:t>
+      </w:r>
+      <w:proofErr w:type="spellStart"/>
+      <w:r>
+        <w:rPr>
+          <w:lang w:val="en-US"/>
+        </w:rPr>
+        <w:t>marca</w:t>
+      </w:r>
+      <w:proofErr w:type="spellEnd"/>
+      <w:r>
+        <w:rPr>
+          <w:lang w:val="en-US"/>
+        </w:rPr>
+        <w:t>": "Nintendo",</w:t>
+      </w:r>
+    </w:p>
+    <w:p>
+      <w:pPr>
+        <w:spacing w:after="0" w:line="240" w:lineRule="auto"/>
+        <w:rPr>
+          <w:lang w:val="en-US"/>
+        </w:rPr>
+      </w:pPr>
+      <w:r>
+        <w:rPr>
+          <w:lang w:val="en-US"/>
+        </w:rPr>
+        <w:t xml:space="preserve">  "</w:t>
+      </w:r>
+      <w:proofErr w:type="spellStart"/>
+      <w:r>
+        <w:rPr>
+          <w:lang w:val="en-US"/>
+        </w:rPr>
+        <w:t>modelo</w:t>
+      </w:r>
+      <w:proofErr w:type="spellEnd"/>
+      <w:r>
+        <w:rPr>
+          <w:lang w:val="en-US"/>
+        </w:rPr>
+        <w:t>": "Switch",</w:t>
+      </w:r>
+    </w:p>
+    <w:p>
+      <w:pPr>
+        <w:spacing w:after="0" w:line="240" w:lineRule="auto"/>
+        <w:rPr>
+          <w:lang w:val="en-US"/>
+        </w:rPr>
+      </w:pPr>
+      <w:r>
+        <w:rPr>
+          <w:lang w:val="en-US"/>
+        </w:rPr>
+        <w:t xml:space="preserve">  "</w:t>
+      </w:r>
+      <w:proofErr w:type="spellStart"/>
+      <w:r>
+        <w:rPr>
+          <w:lang w:val="en-US"/>
+        </w:rPr>
+        <w:t>descripcion</w:t>
+      </w:r>
+      <w:proofErr w:type="spellEnd"/>
+      <w:r>
+        <w:rPr>
+          <w:lang w:val="en-US"/>
+        </w:rPr>
+        <w:t>": "</w:t>
+      </w:r>
+      <w:proofErr w:type="spellStart"/>
+      <w:r>
+        <w:rPr>
+          <w:lang w:val="en-US"/>
+        </w:rPr>
+        <w:t>Secuela</w:t>
+      </w:r>
+      <w:proofErr w:type="spellEnd"/>
+      <w:r>
+        <w:rPr>
+          <w:lang w:val="en-US"/>
+        </w:rPr>
+        <w:t xml:space="preserve"> </w:t>
+      </w:r>
+      <w:proofErr w:type="spellStart"/>
+      <w:r>
+        <w:rPr>
+          <w:lang w:val="en-US"/>
+        </w:rPr>
+        <w:t>directa</w:t>
+      </w:r>
+      <w:proofErr w:type="spellEnd"/>
+      <w:r>
+        <w:rPr>
+          <w:lang w:val="en-US"/>
+        </w:rPr>
+        <w:t xml:space="preserve"> de Breath of the Wild",</w:t>
+      </w:r>
+    </w:p>
+    <w:p>
+      <w:pPr>
+        <w:spacing w:after="0" w:line="240" w:lineRule="auto"/>
+        <w:rPr>
+          <w:lang w:val="en-US"/>
+        </w:rPr>
+      </w:pPr>
+      <w:r>
+        <w:rPr>
+          <w:lang w:val="en-US"/>
+        </w:rPr>
+        <w:t xml:space="preserve">  "</w:t>
+      </w:r>
+      <w:proofErr w:type="spellStart"/>
+      <w:r>
+        <w:rPr>
+          <w:lang w:val="en-US"/>
+        </w:rPr>
+        <w:t>precio</w:t>
+      </w:r>
+      <w:proofErr w:type="spellEnd"/>
+      <w:r>
+        <w:rPr>
+          <w:lang w:val="en-US"/>
+        </w:rPr>
+        <w:t>": 69.99,</w:t>
+      </w:r>
+    </w:p>
+    <w:p>
+      <w:pPr>
+        <w:spacing w:after="0" w:line="240" w:lineRule="auto"/>
+        <w:rPr>
+          <w:lang w:val="en-US"/>
+        </w:rPr>
+      </w:pPr>
+      <w:r>
+        <w:rPr>
+          <w:lang w:val="en-US"/>
+        </w:rPr>
+        <w:t xml:space="preserve">  "</w:t>
+      </w:r>
+      <w:proofErr w:type="spellStart"/>
+      <w:r>
+        <w:rPr>
+          <w:lang w:val="en-US"/>
+        </w:rPr>
+        <w:t>categoriaId</w:t>
+      </w:r>
+      <w:proofErr w:type="spellEnd"/>
+      <w:r>
+        <w:rPr>
+          <w:lang w:val="en-US"/>
+        </w:rPr>
+        <w:t>": 1</w:t>
+      </w:r>
+    </w:p>
+    <w:p>
+      <w:pPr>
+        <w:spacing w:after="0" w:line="240" w:lineRule="auto"/>
+        <w:rPr>
+          <w:lang w:val="en-US"/>
+        </w:rPr>
+      </w:pPr>
+      <w:r>
+        <w:rPr>
+          <w:lang w:val="en-US"/>
         </w:rPr>
         <w:t>}</w:t>
       </w:r>
@@ -1772,15 +1551,15 @@
       <w:pPr>
         <w:spacing w:after="0" w:line="240" w:lineRule="auto"/>
         <w:rPr>
-          <w:lang w:val="es-MX"/>
-        </w:rPr>
-      </w:pPr>
-    </w:p>
-    <w:p>
-      <w:pPr>
-        <w:spacing w:after="0" w:line="240" w:lineRule="auto"/>
-        <w:rPr>
-          <w:lang w:val="es-MX"/>
+          <w:lang w:val="en-US"/>
+        </w:rPr>
+      </w:pPr>
+    </w:p>
+    <w:p>
+      <w:pPr>
+        <w:spacing w:after="0" w:line="240" w:lineRule="auto"/>
+        <w:rPr>
+          <w:lang w:val="en-US"/>
         </w:rPr>
       </w:pPr>
     </w:p>
@@ -1790,47 +1569,194 @@
         <w:rPr>
           <w:sz w:val="36"/>
           <w:szCs w:val="36"/>
-          <w:lang w:val="es-MX"/>
-        </w:rPr>
-      </w:pPr>
+          <w:lang w:val="en-US"/>
+        </w:rPr>
+      </w:pPr>
+      <w:proofErr w:type="gramStart"/>
       <w:r>
         <w:rPr>
           <w:sz w:val="36"/>
           <w:szCs w:val="36"/>
           <w:highlight w:val="yellow"/>
-          <w:lang w:val="es-MX"/>
-        </w:rPr>
-        <w:t>PROMOTION-SERVICE:</w:t>
-      </w:r>
-    </w:p>
-    <w:p>
-      <w:pPr>
-        <w:spacing w:after="0" w:line="240" w:lineRule="auto"/>
-        <w:rPr>
-          <w:lang w:val="es-MX"/>
+          <w:lang w:val="en-US"/>
+        </w:rPr>
+        <w:t>INVENTORY-SERVICE</w:t>
+      </w:r>
+      <w:proofErr w:type="gramEnd"/>
+      <w:r>
+        <w:rPr>
+          <w:sz w:val="36"/>
+          <w:szCs w:val="36"/>
+          <w:highlight w:val="yellow"/>
+          <w:lang w:val="en-US"/>
+        </w:rPr>
+        <w:t>:</w:t>
+      </w:r>
+    </w:p>
+    <w:p>
+      <w:pPr>
+        <w:spacing w:after="0" w:line="240" w:lineRule="auto"/>
+        <w:rPr>
+          <w:lang w:val="en-US"/>
+        </w:rPr>
+      </w:pPr>
+      <w:r>
+        <w:rPr>
+          <w:lang w:val="en-US"/>
+        </w:rPr>
+        <w:t>http://localhost:8085/api/inventor</w:t>
+      </w:r>
+      <w:r>
+        <w:rPr>
+          <w:lang w:val="en-US"/>
+        </w:rPr>
+        <w:t>y/setup</w:t>
+      </w:r>
+    </w:p>
+    <w:p>
+      <w:pPr>
+        <w:spacing w:after="0" w:line="240" w:lineRule="auto"/>
+        <w:rPr>
+          <w:lang w:val="en-US"/>
+        </w:rPr>
+      </w:pPr>
+      <w:r>
+        <w:rPr>
+          <w:lang w:val="en-US"/>
+        </w:rPr>
+        <w:t>{</w:t>
+      </w:r>
+    </w:p>
+    <w:p>
+      <w:pPr>
+        <w:spacing w:after="0" w:line="240" w:lineRule="auto"/>
+        <w:rPr>
+          <w:lang w:val="en-US"/>
+        </w:rPr>
+      </w:pPr>
+      <w:r>
+        <w:rPr>
+          <w:lang w:val="en-US"/>
+        </w:rPr>
+        <w:t xml:space="preserve">  "</w:t>
+      </w:r>
+      <w:proofErr w:type="spellStart"/>
+      <w:r>
+        <w:rPr>
+          <w:lang w:val="en-US"/>
+        </w:rPr>
+        <w:t>productId</w:t>
+      </w:r>
+      <w:proofErr w:type="spellEnd"/>
+      <w:r>
+        <w:rPr>
+          <w:lang w:val="en-US"/>
+        </w:rPr>
+        <w:t>": 1,</w:t>
+      </w:r>
+    </w:p>
+    <w:p>
+      <w:pPr>
+        <w:spacing w:after="0" w:line="240" w:lineRule="auto"/>
+        <w:rPr>
+          <w:lang w:val="en-US"/>
+        </w:rPr>
+      </w:pPr>
+      <w:r>
+        <w:rPr>
+          <w:lang w:val="en-US"/>
+        </w:rPr>
+        <w:t xml:space="preserve">  "quantity": 150,</w:t>
+      </w:r>
+    </w:p>
+    <w:p>
+      <w:pPr>
+        <w:spacing w:after="0" w:line="240" w:lineRule="auto"/>
+        <w:rPr>
+          <w:lang w:val="en-US"/>
+        </w:rPr>
+      </w:pPr>
+      <w:r>
+        <w:rPr>
+          <w:lang w:val="en-US"/>
+        </w:rPr>
+        <w:t xml:space="preserve">  "location": "Bodega Central"</w:t>
+      </w:r>
+    </w:p>
+    <w:p>
+      <w:pPr>
+        <w:spacing w:after="0" w:line="240" w:lineRule="auto"/>
+        <w:rPr>
+          <w:lang w:val="en-US"/>
+        </w:rPr>
+      </w:pPr>
+      <w:r>
+        <w:rPr>
+          <w:lang w:val="en-US"/>
+        </w:rPr>
+        <w:t>}</w:t>
+      </w:r>
+    </w:p>
+    <w:p>
+      <w:pPr>
+        <w:spacing w:after="0" w:line="240" w:lineRule="auto"/>
+        <w:rPr>
+          <w:lang w:val="en-US"/>
+        </w:rPr>
+      </w:pPr>
+    </w:p>
+    <w:p>
+      <w:pPr>
+        <w:spacing w:after="0" w:line="240" w:lineRule="auto"/>
+        <w:rPr>
+          <w:lang w:val="en-US"/>
+        </w:rPr>
+      </w:pPr>
+    </w:p>
+    <w:p>
+      <w:pPr>
+        <w:spacing w:after="0" w:line="240" w:lineRule="auto"/>
+        <w:rPr>
+          <w:sz w:val="36"/>
+          <w:szCs w:val="36"/>
+          <w:lang w:val="en-US"/>
+        </w:rPr>
+      </w:pPr>
+      <w:proofErr w:type="gramStart"/>
+      <w:r>
+        <w:rPr>
+          <w:sz w:val="36"/>
+          <w:szCs w:val="36"/>
+          <w:highlight w:val="yellow"/>
+          <w:lang w:val="en-US"/>
+        </w:rPr>
+        <w:t>PROMOTION-SERVICE</w:t>
+      </w:r>
+      <w:proofErr w:type="gramEnd"/>
+      <w:r>
+        <w:rPr>
+          <w:sz w:val="36"/>
+          <w:szCs w:val="36"/>
+          <w:highlight w:val="yellow"/>
+          <w:lang w:val="en-US"/>
+        </w:rPr>
+        <w:t>:</w:t>
+      </w:r>
+    </w:p>
+    <w:p>
+      <w:pPr>
+        <w:spacing w:after="0" w:line="240" w:lineRule="auto"/>
+        <w:rPr>
+          <w:lang w:val="en-US"/>
         </w:rPr>
       </w:pPr>
       <w:hyperlink r:id="rId5" w:history="1">
         <w:r>
           <w:rPr>
             <w:rStyle w:val="Hipervnculo"/>
-            <w:lang w:val="es-MX"/>
+            <w:lang w:val="en-US"/>
           </w:rPr>
-          <w:t>http://localhost:808</w:t>
-        </w:r>
-        <w:r>
-          <w:rPr>
-            <w:rStyle w:val="Hipervnculo"/>
-            <w:lang w:val="es-MX"/>
-          </w:rPr>
-          <w:t>4</w:t>
-        </w:r>
-        <w:r>
-          <w:rPr>
-            <w:rStyle w:val="Hipervnculo"/>
-            <w:lang w:val="es-MX"/>
-          </w:rPr>
-          <w:t>/api/promotions</w:t>
+          <w:t>http://localhost:8084/api/promotions</w:t>
         </w:r>
       </w:hyperlink>
     </w:p>
@@ -1838,7 +1764,7 @@
       <w:pPr>
         <w:spacing w:after="0" w:line="240" w:lineRule="auto"/>
         <w:rPr>
-          <w:lang w:val="es-MX"/>
+          <w:lang w:val="en-US"/>
         </w:rPr>
       </w:pPr>
     </w:p>
@@ -2259,141 +2185,67 @@
     <w:p>
       <w:pPr>
         <w:spacing w:after="0" w:line="240" w:lineRule="auto"/>
-        <w:rPr>
-          <w:lang w:val="en-US"/>
-        </w:rPr>
       </w:pPr>
       <w:r>
         <w:t xml:space="preserve">      </w:t>
       </w:r>
       <w:r>
-        <w:rPr>
-          <w:lang w:val="en-US"/>
-        </w:rPr>
-        <w:t>"</w:t>
-      </w:r>
-      <w:proofErr w:type="spellStart"/>
-      <w:r>
-        <w:rPr>
-          <w:lang w:val="en-US"/>
-        </w:rPr>
-        <w:t>cantidad</w:t>
-      </w:r>
-      <w:proofErr w:type="spellEnd"/>
-      <w:r>
-        <w:rPr>
-          <w:lang w:val="en-US"/>
-        </w:rPr>
-        <w:t>": 2</w:t>
-      </w:r>
-    </w:p>
-    <w:p>
-      <w:pPr>
-        <w:spacing w:after="0" w:line="240" w:lineRule="auto"/>
-        <w:rPr>
-          <w:lang w:val="en-US"/>
-        </w:rPr>
-      </w:pPr>
-      <w:r>
-        <w:rPr>
-          <w:lang w:val="en-US"/>
-        </w:rPr>
+        <w:t>"cantidad": 2</w:t>
+      </w:r>
+    </w:p>
+    <w:p>
+      <w:pPr>
+        <w:spacing w:after="0" w:line="240" w:lineRule="auto"/>
+      </w:pPr>
+      <w:r>
         <w:t xml:space="preserve">    }</w:t>
       </w:r>
     </w:p>
     <w:p>
       <w:pPr>
         <w:spacing w:after="0" w:line="240" w:lineRule="auto"/>
-        <w:rPr>
-          <w:lang w:val="en-US"/>
-        </w:rPr>
-      </w:pPr>
-      <w:r>
-        <w:rPr>
-          <w:lang w:val="en-US"/>
-        </w:rPr>
+      </w:pPr>
+      <w:r>
         <w:t xml:space="preserve">  ]</w:t>
       </w:r>
     </w:p>
     <w:p>
       <w:pPr>
         <w:spacing w:after="0" w:line="240" w:lineRule="auto"/>
-        <w:rPr>
-          <w:lang w:val="en-US"/>
-        </w:rPr>
-      </w:pPr>
-      <w:r>
-        <w:rPr>
-          <w:lang w:val="en-US"/>
-        </w:rPr>
+      </w:pPr>
+      <w:r>
         <w:t>}</w:t>
       </w:r>
       <w:r>
-        <w:rPr>
-          <w:lang w:val="en-US"/>
-        </w:rPr>
         <w:br/>
       </w:r>
     </w:p>
     <w:p>
       <w:pPr>
         <w:spacing w:after="0" w:line="240" w:lineRule="auto"/>
-        <w:rPr>
-          <w:lang w:val="en-US"/>
-        </w:rPr>
-      </w:pPr>
-      <w:r>
-        <w:rPr>
-          <w:lang w:val="en-US"/>
-        </w:rPr>
+      </w:pPr>
+      <w:r>
         <w:br/>
       </w:r>
-      <w:proofErr w:type="gramStart"/>
       <w:r>
         <w:rPr>
           <w:sz w:val="36"/>
           <w:szCs w:val="36"/>
           <w:highlight w:val="yellow"/>
-          <w:lang w:val="en-US"/>
-        </w:rPr>
-        <w:t>PAYMENT-SERVICE</w:t>
-      </w:r>
-      <w:proofErr w:type="gramEnd"/>
-      <w:r>
-        <w:rPr>
-          <w:sz w:val="36"/>
-          <w:szCs w:val="36"/>
-          <w:highlight w:val="yellow"/>
-          <w:lang w:val="en-US"/>
-        </w:rPr>
-        <w:t>:</w:t>
-      </w:r>
-    </w:p>
-    <w:p>
-      <w:pPr>
-        <w:spacing w:after="0" w:line="240" w:lineRule="auto"/>
-        <w:rPr>
-          <w:lang w:val="en-US"/>
-        </w:rPr>
+        </w:rPr>
+        <w:t>PAYMENT-SERVICE:</w:t>
+      </w:r>
+    </w:p>
+    <w:p>
+      <w:pPr>
+        <w:spacing w:after="0" w:line="240" w:lineRule="auto"/>
       </w:pPr>
       <w:hyperlink r:id="rId6" w:history="1">
         <w:r>
           <w:rPr>
             <w:rStyle w:val="Hipervnculo"/>
           </w:rPr>
-          <w:t>http://localhost:808</w:t>
-        </w:r>
-        <w:r>
-          <w:rPr>
-            <w:rStyle w:val="Hipervnculo"/>
-          </w:rPr>
-          <w:t>9</w:t>
-        </w:r>
-        <w:r>
-          <w:rPr>
-            <w:rStyle w:val="Hipervnculo"/>
-          </w:rPr>
-          <w:t>/api/payments</w:t>
+          <w:t>http://localhost:8089/api/payments</w:t>
         </w:r>
       </w:hyperlink>
     </w:p>
@@ -2557,189 +2409,108 @@
     <w:p>
       <w:pPr>
         <w:spacing w:after="0" w:line="240" w:lineRule="auto"/>
-        <w:rPr>
-          <w:lang w:val="en-US"/>
-        </w:rPr>
-      </w:pPr>
-      <w:r>
-        <w:rPr>
-          <w:lang w:val="en-US"/>
-        </w:rPr>
+      </w:pPr>
+      <w:r>
         <w:t>}</w:t>
       </w:r>
     </w:p>
     <w:p>
       <w:pPr>
         <w:spacing w:after="0" w:line="240" w:lineRule="auto"/>
-        <w:rPr>
-          <w:lang w:val="en-US"/>
-        </w:rPr>
-      </w:pPr>
-    </w:p>
-    <w:p>
-      <w:pPr>
-        <w:spacing w:after="0" w:line="240" w:lineRule="auto"/>
-        <w:rPr>
-          <w:lang w:val="en-US"/>
-        </w:rPr>
+      </w:pPr>
+    </w:p>
+    <w:p>
+      <w:pPr>
+        <w:spacing w:after="0" w:line="240" w:lineRule="auto"/>
       </w:pPr>
       <w:r>
         <w:rPr>
           <w:sz w:val="36"/>
           <w:szCs w:val="36"/>
           <w:highlight w:val="yellow"/>
-          <w:lang w:val="en-US"/>
         </w:rPr>
         <w:t>SHIPPING-SERVICE:</w:t>
       </w:r>
       <w:r>
-        <w:rPr>
-          <w:lang w:val="en-US"/>
-        </w:rPr>
         <w:br/>
-      </w:r>
-      <w:r>
-        <w:rPr>
-          <w:lang w:val="en-US"/>
-        </w:rPr>
         <w:t>http://localhost:808</w:t>
       </w:r>
       <w:r>
-        <w:rPr>
-          <w:lang w:val="en-US"/>
-        </w:rPr>
         <w:t>7</w:t>
       </w:r>
       <w:r>
-        <w:rPr>
-          <w:lang w:val="en-US"/>
-        </w:rPr>
         <w:t>/api/shippings</w:t>
       </w:r>
     </w:p>
     <w:p>
       <w:pPr>
         <w:spacing w:after="0" w:line="240" w:lineRule="auto"/>
-        <w:rPr>
-          <w:lang w:val="en-US"/>
-        </w:rPr>
-      </w:pPr>
-    </w:p>
-    <w:p>
-      <w:pPr>
-        <w:spacing w:after="0" w:line="240" w:lineRule="auto"/>
-        <w:rPr>
-          <w:lang w:val="en-US"/>
-        </w:rPr>
-      </w:pPr>
-      <w:r>
-        <w:rPr>
-          <w:lang w:val="en-US"/>
-        </w:rPr>
+      </w:pPr>
+    </w:p>
+    <w:p>
+      <w:pPr>
+        <w:spacing w:after="0" w:line="240" w:lineRule="auto"/>
+      </w:pPr>
+      <w:r>
         <w:t>{</w:t>
       </w:r>
     </w:p>
     <w:p>
       <w:pPr>
         <w:spacing w:after="0" w:line="240" w:lineRule="auto"/>
-        <w:rPr>
-          <w:lang w:val="en-US"/>
-        </w:rPr>
-      </w:pPr>
-      <w:r>
-        <w:rPr>
-          <w:lang w:val="en-US"/>
-        </w:rPr>
+      </w:pPr>
+      <w:r>
         <w:t xml:space="preserve">  "</w:t>
       </w:r>
       <w:proofErr w:type="spellStart"/>
       <w:r>
-        <w:rPr>
-          <w:lang w:val="en-US"/>
-        </w:rPr>
         <w:t>orderId</w:t>
       </w:r>
       <w:proofErr w:type="spellEnd"/>
       <w:r>
-        <w:rPr>
-          <w:lang w:val="en-US"/>
-        </w:rPr>
         <w:t>": 1,</w:t>
       </w:r>
     </w:p>
     <w:p>
       <w:pPr>
         <w:spacing w:after="0" w:line="240" w:lineRule="auto"/>
-        <w:rPr>
-          <w:lang w:val="en-US"/>
-        </w:rPr>
-      </w:pPr>
-      <w:r>
-        <w:rPr>
-          <w:lang w:val="en-US"/>
-        </w:rPr>
+      </w:pPr>
+      <w:r>
         <w:t xml:space="preserve">  "</w:t>
       </w:r>
       <w:proofErr w:type="spellStart"/>
       <w:r>
-        <w:rPr>
-          <w:lang w:val="en-US"/>
-        </w:rPr>
         <w:t>userId</w:t>
       </w:r>
       <w:proofErr w:type="spellEnd"/>
       <w:r>
-        <w:rPr>
-          <w:lang w:val="en-US"/>
-        </w:rPr>
         <w:t>": 1,</w:t>
       </w:r>
     </w:p>
     <w:p>
       <w:pPr>
         <w:spacing w:after="0" w:line="240" w:lineRule="auto"/>
-        <w:rPr>
-          <w:lang w:val="en-US"/>
-        </w:rPr>
-      </w:pPr>
-      <w:r>
-        <w:rPr>
-          <w:lang w:val="en-US"/>
-        </w:rPr>
-        <w:t xml:space="preserve">  "carrier": "</w:t>
-      </w:r>
-      <w:proofErr w:type="spellStart"/>
-      <w:r>
-        <w:rPr>
-          <w:lang w:val="en-US"/>
-        </w:rPr>
-        <w:t>Chilexpress</w:t>
-      </w:r>
-      <w:proofErr w:type="spellEnd"/>
-      <w:r>
-        <w:rPr>
-          <w:lang w:val="en-US"/>
-        </w:rPr>
-        <w:t>"</w:t>
-      </w:r>
-    </w:p>
-    <w:p>
-      <w:pPr>
-        <w:spacing w:after="0" w:line="240" w:lineRule="auto"/>
-        <w:rPr>
-          <w:lang w:val="en-US"/>
-        </w:rPr>
-      </w:pPr>
-      <w:r>
-        <w:rPr>
-          <w:lang w:val="en-US"/>
-        </w:rPr>
+      </w:pPr>
+      <w:r>
+        <w:t xml:space="preserve">  "</w:t>
+      </w:r>
+      <w:proofErr w:type="spellStart"/>
+      <w:r>
+        <w:t>carrier</w:t>
+      </w:r>
+      <w:proofErr w:type="spellEnd"/>
+      <w:r>
+        <w:t>": "Chilexpress"</w:t>
+      </w:r>
+    </w:p>
+    <w:p>
+      <w:pPr>
+        <w:spacing w:after="0" w:line="240" w:lineRule="auto"/>
+      </w:pPr>
+      <w:r>
         <w:t>}</w:t>
       </w:r>
       <w:r>
-        <w:rPr>
-          <w:lang w:val="en-US"/>
-        </w:rPr>
         <w:br/>
       </w:r>
     </w:p>
@@ -2761,39 +2532,6 @@
       <w:pPr>
         <w:spacing w:after="0" w:line="240" w:lineRule="auto"/>
       </w:pPr>
-    </w:p>
-    <w:p>
-      <w:pPr>
-        <w:spacing w:after="0" w:line="240" w:lineRule="auto"/>
-      </w:pPr>
-      <w:r>
-        <w:rPr>
-          <w:b/>
-          <w:bCs/>
-        </w:rPr>
-        <w:lastRenderedPageBreak/>
-        <w:t>GET</w:t>
-      </w:r>
-      <w:r>
-        <w:rPr>
-          <w:b/>
-          <w:bCs/>
-        </w:rPr>
-        <w:t xml:space="preserve"> </w:t>
-      </w:r>
-      <w:r>
-        <w:rPr>
-          <w:b/>
-          <w:bCs/>
-        </w:rPr>
-        <w:t>– para ver seguimiento</w:t>
-      </w:r>
-      <w:r>
-        <w:t xml:space="preserve"> </w:t>
-      </w:r>
-      <w:r>
-        <w:t>http://localhost:8088/api/shippings/1?estado=EN_TRANSITO&amp;trackingNumber=CHX-99887766</w:t>
-      </w:r>
     </w:p>
     <w:p>
       <w:pPr>
@@ -2826,19 +2564,7 @@
           <w:rPr>
             <w:rStyle w:val="Hipervnculo"/>
           </w:rPr>
-          <w:t>http://localhost:808</w:t>
-        </w:r>
-        <w:r>
-          <w:rPr>
-            <w:rStyle w:val="Hipervnculo"/>
-          </w:rPr>
-          <w:t>8</w:t>
-        </w:r>
-        <w:r>
-          <w:rPr>
-            <w:rStyle w:val="Hipervnculo"/>
-          </w:rPr>
-          <w:t>/api/resenas</w:t>
+          <w:t>http://localhost:8088/api/resenas</w:t>
         </w:r>
       </w:hyperlink>
     </w:p>
@@ -4157,6 +3883,7 @@
   <w:style w:type="character" w:default="1" w:styleId="Fuentedeprrafopredeter">
     <w:name w:val="Default Paragraph Font"/>
     <w:uiPriority w:val="1"/>
+    <w:semiHidden/>
     <w:unhideWhenUsed/>
   </w:style>
   <w:style w:type="table" w:default="1" w:styleId="Tablanormal">

</xml_diff>